<commit_message>
Cambiar la información de la versión del amigo: otros eventos, autores y ejemplos
Co-Authored-By: Claude Opus 5.5 <noreply@anthropic.com>
Claude-Session: https://claude.ai/code/session_01XaymjaBM2jRQ7ueuDfYuxC
</commit_message>
<xml_diff>
--- a/investigacion/Guia de estudio - Amigo.docx
+++ b/investigacion/Guia de estudio - Amigo.docx
@@ -19,7 +19,7 @@
         <w:rPr>
           <w:b/>
           <w:bCs/>
-          <w:color w:val="5B3FD6"/>
+          <w:color w:val="0E8F8A"/>
           <w:sz w:val="28"/>
           <w:szCs w:val="28"/>
         </w:rPr>
@@ -90,7 +90,7 @@
       </w:pPr>
       <w:r>
         <w:rPr>
-          <w:color w:val="5B3FD6"/>
+          <w:color w:val="0E8F8A"/>
         </w:rPr>
         <w:t xml:space="preserve">1. Los dos conceptos</w:t>
       </w:r>
@@ -103,32 +103,12 @@
         <w:rPr>
           <w:b/>
           <w:bCs/>
-          <w:color w:val="5B3FD6"/>
+          <w:color w:val="0E8F8A"/>
         </w:rPr>
         <w:t xml:space="preserve">Curva de la experiencia: </w:t>
       </w:r>
       <w:r>
-        <w:t xml:space="preserve">mientras más veces hacemos algo, menos tiempo y dinero nos cuesta. Cada vez que se </w:t>
-      </w:r>
-      <w:r>
-        <w:rPr>
-          <w:b/>
-          <w:bCs/>
-        </w:rPr>
-        <w:t xml:space="preserve">duplica</w:t>
-      </w:r>
-      <w:r>
-        <w:t xml:space="preserve"> lo producido, el costo baja entre un </w:t>
-      </w:r>
-      <w:r>
-        <w:rPr>
-          <w:b/>
-          <w:bCs/>
-        </w:rPr>
-        <w:t xml:space="preserve">20 % y un 30 %</w:t>
-      </w:r>
-      <w:r>
-        <w:t xml:space="preserve">.</w:t>
+        <w:t xml:space="preserve">es una gráfica que muestra cómo bajan el tiempo y el costo de una tarea a medida que se acumula práctica. Al principio se mejora rápido y después más despacio. Louis Thurstone la escribió como ecuación en 1919.</w:t>
       </w:r>
     </w:p>
     <w:p>
@@ -139,22 +119,12 @@
         <w:rPr>
           <w:b/>
           <w:bCs/>
-          <w:color w:val="E07B16"/>
+          <w:color w:val="DB2777"/>
         </w:rPr>
         <w:t xml:space="preserve">Antigüedad: </w:t>
       </w:r>
       <w:r>
-        <w:t xml:space="preserve">el </w:t>
-      </w:r>
-      <w:r>
-        <w:rPr>
-          <w:b/>
-          <w:bCs/>
-        </w:rPr>
-        <w:t xml:space="preserve">tiempo</w:t>
-      </w:r>
-      <w:r>
-        <w:t xml:space="preserve"> que una persona lleva en un trabajo o institución. Da derechos como vacaciones, prima, liquidación y preferencia para ascender.</w:t>
+        <w:t xml:space="preserve">son los años de servicio que la ley o la empresa reconocen. Se usan para calcular dinero al terminar un trabajo, como las cesantías en Colombia o la indemnización por años de servicio en Chile.</w:t>
       </w:r>
     </w:p>
     <w:p>
@@ -166,10 +136,10 @@
           <w:b/>
           <w:bCs/>
         </w:rPr>
-        <w:t xml:space="preserve">Diferencia: </w:t>
-      </w:r>
-      <w:r>
-        <w:t xml:space="preserve">la antigüedad es tiempo; la experiencia es práctica. Tener muchos años en un lugar no siempre significa saber más.</w:t>
+        <w:t xml:space="preserve">Idea clave: </w:t>
+      </w:r>
+      <w:r>
+        <w:t xml:space="preserve">según Anders Ericsson, no basta con pasar tiempo haciendo algo; lo que hace mejorar es la práctica deliberada, con metas y corrección de errores.</w:t>
       </w:r>
     </w:p>
     <w:p>
@@ -179,7 +149,7 @@
       </w:pPr>
       <w:r>
         <w:rPr>
-          <w:color w:val="5B3FD6"/>
+          <w:color w:val="0E8F8A"/>
         </w:rPr>
         <w:t xml:space="preserve">2. Fechas que debes saber</w:t>
       </w:r>
@@ -214,7 +184,7 @@
               <w:bottom w:val="single" w:color="D9D4E7" w:sz="4"/>
               <w:right w:val="single" w:color="D9D4E7" w:sz="4"/>
             </w:tcBorders>
-            <w:shd w:fill="5B3FD6" w:color="auto" w:val="clear"/>
+            <w:shd w:fill="0E8F8A" w:color="auto" w:val="clear"/>
             <w:tcMar>
               <w:top w:type="dxa" w:w="80"/>
               <w:left w:type="dxa" w:w="120"/>
@@ -242,7 +212,7 @@
               <w:bottom w:val="single" w:color="D9D4E7" w:sz="4"/>
               <w:right w:val="single" w:color="D9D4E7" w:sz="4"/>
             </w:tcBorders>
-            <w:shd w:fill="5B3FD6" w:color="auto" w:val="clear"/>
+            <w:shd w:fill="0E8F8A" w:color="auto" w:val="clear"/>
             <w:tcMar>
               <w:top w:type="dxa" w:w="80"/>
               <w:left w:type="dxa" w:w="120"/>
@@ -270,7 +240,7 @@
               <w:bottom w:val="single" w:color="D9D4E7" w:sz="4"/>
               <w:right w:val="single" w:color="D9D4E7" w:sz="4"/>
             </w:tcBorders>
-            <w:shd w:fill="5B3FD6" w:color="auto" w:val="clear"/>
+            <w:shd w:fill="0E8F8A" w:color="auto" w:val="clear"/>
             <w:tcMar>
               <w:top w:type="dxa" w:w="80"/>
               <w:left w:type="dxa" w:w="120"/>
@@ -313,7 +283,7 @@
                 <w:b/>
                 <w:bCs/>
               </w:rPr>
-              <w:t xml:space="preserve">1776</w:t>
+              <w:t xml:space="preserve">1883</w:t>
             </w:r>
           </w:p>
         </w:tc>
@@ -339,7 +309,7 @@
                 <w:b/>
                 <w:bCs/>
               </w:rPr>
-              <w:t xml:space="preserve">Adam Smith</w:t>
+              <w:t xml:space="preserve">Ley Pendleton (EE. UU.)</w:t>
             </w:r>
           </w:p>
         </w:tc>
@@ -361,7 +331,7 @@
           </w:tcPr>
           <w:p>
             <w:r>
-              <w:t xml:space="preserve">La división del trabajo: repetir una sola tarea hace más hábil al trabajador.</w:t>
+              <w:t xml:space="preserve">Crea el servicio civil de carrera: los puestos públicos se ganan por mérito y no se regalan.</w:t>
             </w:r>
           </w:p>
         </w:tc>
@@ -376,21 +346,21 @@
               <w:bottom w:val="single" w:color="D9D4E7" w:sz="4"/>
               <w:right w:val="single" w:color="D9D4E7" w:sz="4"/>
             </w:tcBorders>
-            <w:shd w:fill="F4F1FD" w:color="auto" w:val="clear"/>
-            <w:tcMar>
-              <w:top w:type="dxa" w:w="80"/>
-              <w:left w:type="dxa" w:w="120"/>
-              <w:bottom w:type="dxa" w:w="80"/>
-              <w:right w:type="dxa" w:w="120"/>
-            </w:tcMar>
-          </w:tcPr>
-          <w:p>
-            <w:r>
-              <w:rPr>
-                <w:b/>
-                <w:bCs/>
-              </w:rPr>
-              <w:t xml:space="preserve">1908</w:t>
+            <w:shd w:fill="E6F6F5" w:color="auto" w:val="clear"/>
+            <w:tcMar>
+              <w:top w:type="dxa" w:w="80"/>
+              <w:left w:type="dxa" w:w="120"/>
+              <w:bottom w:type="dxa" w:w="80"/>
+              <w:right w:type="dxa" w:w="120"/>
+            </w:tcMar>
+          </w:tcPr>
+          <w:p>
+            <w:r>
+              <w:rPr>
+                <w:b/>
+                <w:bCs/>
+              </w:rPr>
+              <w:t xml:space="preserve">1911</w:t>
             </w:r>
           </w:p>
         </w:tc>
@@ -403,21 +373,21 @@
               <w:bottom w:val="single" w:color="D9D4E7" w:sz="4"/>
               <w:right w:val="single" w:color="D9D4E7" w:sz="4"/>
             </w:tcBorders>
-            <w:shd w:fill="F4F1FD" w:color="auto" w:val="clear"/>
-            <w:tcMar>
-              <w:top w:type="dxa" w:w="80"/>
-              <w:left w:type="dxa" w:w="120"/>
-              <w:bottom w:type="dxa" w:w="80"/>
-              <w:right w:type="dxa" w:w="120"/>
-            </w:tcMar>
-          </w:tcPr>
-          <w:p>
-            <w:r>
-              <w:rPr>
-                <w:b/>
-                <w:bCs/>
-              </w:rPr>
-              <w:t xml:space="preserve">Ford Modelo T</w:t>
+            <w:shd w:fill="E6F6F5" w:color="auto" w:val="clear"/>
+            <w:tcMar>
+              <w:top w:type="dxa" w:w="80"/>
+              <w:left w:type="dxa" w:w="120"/>
+              <w:bottom w:type="dxa" w:w="80"/>
+              <w:right w:type="dxa" w:w="120"/>
+            </w:tcMar>
+          </w:tcPr>
+          <w:p>
+            <w:r>
+              <w:rPr>
+                <w:b/>
+                <w:bCs/>
+              </w:rPr>
+              <w:t xml:space="preserve">Frederick Taylor</w:t>
             </w:r>
           </w:p>
         </w:tc>
@@ -430,17 +400,17 @@
               <w:bottom w:val="single" w:color="D9D4E7" w:sz="4"/>
               <w:right w:val="single" w:color="D9D4E7" w:sz="4"/>
             </w:tcBorders>
-            <w:shd w:fill="F4F1FD" w:color="auto" w:val="clear"/>
-            <w:tcMar>
-              <w:top w:type="dxa" w:w="80"/>
-              <w:left w:type="dxa" w:w="120"/>
-              <w:bottom w:type="dxa" w:w="80"/>
-              <w:right w:type="dxa" w:w="120"/>
-            </w:tcMar>
-          </w:tcPr>
-          <w:p>
-            <w:r>
-              <w:t xml:space="preserve">Al fabricar más autos, el precio bajó de 850 a 260 dólares (1925).</w:t>
+            <w:shd w:fill="E6F6F5" w:color="auto" w:val="clear"/>
+            <w:tcMar>
+              <w:top w:type="dxa" w:w="80"/>
+              <w:left w:type="dxa" w:w="120"/>
+              <w:bottom w:type="dxa" w:w="80"/>
+              <w:right w:type="dxa" w:w="120"/>
+            </w:tcMar>
+          </w:tcPr>
+          <w:p>
+            <w:r>
+              <w:t xml:space="preserve">Publica la administración científica: medir tiempos y movimientos para trabajar más rápido.</w:t>
             </w:r>
           </w:p>
         </w:tc>
@@ -468,7 +438,7 @@
                 <w:b/>
                 <w:bCs/>
               </w:rPr>
-              <w:t xml:space="preserve">1917</w:t>
+              <w:t xml:space="preserve">1919</w:t>
             </w:r>
           </w:p>
         </w:tc>
@@ -494,7 +464,7 @@
                 <w:b/>
                 <w:bCs/>
               </w:rPr>
-              <w:t xml:space="preserve">Artículo 123</w:t>
+              <w:t xml:space="preserve">Louis L. Thurstone</w:t>
             </w:r>
           </w:p>
         </w:tc>
@@ -516,7 +486,7 @@
           </w:tcPr>
           <w:p>
             <w:r>
-              <w:t xml:space="preserve">La Constitución mexicana sienta las bases de los derechos laborales.</w:t>
+              <w:t xml:space="preserve">Escribe "The learning curve equation", la primera ecuación matemática de la curva de aprendizaje.</w:t>
             </w:r>
           </w:p>
         </w:tc>
@@ -531,21 +501,21 @@
               <w:bottom w:val="single" w:color="D9D4E7" w:sz="4"/>
               <w:right w:val="single" w:color="D9D4E7" w:sz="4"/>
             </w:tcBorders>
-            <w:shd w:fill="F4F1FD" w:color="auto" w:val="clear"/>
-            <w:tcMar>
-              <w:top w:type="dxa" w:w="80"/>
-              <w:left w:type="dxa" w:w="120"/>
-              <w:bottom w:type="dxa" w:w="80"/>
-              <w:right w:type="dxa" w:w="120"/>
-            </w:tcMar>
-          </w:tcPr>
-          <w:p>
-            <w:r>
-              <w:rPr>
-                <w:b/>
-                <w:bCs/>
-              </w:rPr>
-              <w:t xml:space="preserve">1936</w:t>
+            <w:shd w:fill="E6F6F5" w:color="auto" w:val="clear"/>
+            <w:tcMar>
+              <w:top w:type="dxa" w:w="80"/>
+              <w:left w:type="dxa" w:w="120"/>
+              <w:bottom w:type="dxa" w:w="80"/>
+              <w:right w:type="dxa" w:w="120"/>
+            </w:tcMar>
+          </w:tcPr>
+          <w:p>
+            <w:r>
+              <w:rPr>
+                <w:b/>
+                <w:bCs/>
+              </w:rPr>
+              <w:t xml:space="preserve">1934</w:t>
             </w:r>
           </w:p>
         </w:tc>
@@ -558,21 +528,21 @@
               <w:bottom w:val="single" w:color="D9D4E7" w:sz="4"/>
               <w:right w:val="single" w:color="D9D4E7" w:sz="4"/>
             </w:tcBorders>
-            <w:shd w:fill="F4F1FD" w:color="auto" w:val="clear"/>
-            <w:tcMar>
-              <w:top w:type="dxa" w:w="80"/>
-              <w:left w:type="dxa" w:w="120"/>
-              <w:bottom w:type="dxa" w:w="80"/>
-              <w:right w:type="dxa" w:w="120"/>
-            </w:tcMar>
-          </w:tcPr>
-          <w:p>
-            <w:r>
-              <w:rPr>
-                <w:b/>
-                <w:bCs/>
-              </w:rPr>
-              <w:t xml:space="preserve">Curva de aprendizaje</w:t>
+            <w:shd w:fill="E6F6F5" w:color="auto" w:val="clear"/>
+            <w:tcMar>
+              <w:top w:type="dxa" w:w="80"/>
+              <w:left w:type="dxa" w:w="120"/>
+              <w:bottom w:type="dxa" w:w="80"/>
+              <w:right w:type="dxa" w:w="120"/>
+            </w:tcMar>
+          </w:tcPr>
+          <w:p>
+            <w:r>
+              <w:rPr>
+                <w:b/>
+                <w:bCs/>
+              </w:rPr>
+              <w:t xml:space="preserve">Cesantías (Colombia)</w:t>
             </w:r>
           </w:p>
         </w:tc>
@@ -585,17 +555,17 @@
               <w:bottom w:val="single" w:color="D9D4E7" w:sz="4"/>
               <w:right w:val="single" w:color="D9D4E7" w:sz="4"/>
             </w:tcBorders>
-            <w:shd w:fill="F4F1FD" w:color="auto" w:val="clear"/>
-            <w:tcMar>
-              <w:top w:type="dxa" w:w="80"/>
-              <w:left w:type="dxa" w:w="120"/>
-              <w:bottom w:type="dxa" w:w="80"/>
-              <w:right w:type="dxa" w:w="120"/>
-            </w:tcMar>
-          </w:tcPr>
-          <w:p>
-            <w:r>
-              <w:t xml:space="preserve">T. P. Wright: cada vez que se duplica la producción, baja el tiempo por unidad.</w:t>
+            <w:shd w:fill="E6F6F5" w:color="auto" w:val="clear"/>
+            <w:tcMar>
+              <w:top w:type="dxa" w:w="80"/>
+              <w:left w:type="dxa" w:w="120"/>
+              <w:bottom w:type="dxa" w:w="80"/>
+              <w:right w:type="dxa" w:w="120"/>
+            </w:tcMar>
+          </w:tcPr>
+          <w:p>
+            <w:r>
+              <w:t xml:space="preserve">La Ley 10 crea el auxilio de cesantía. En 1950 el Código Sustantivo del Trabajo fija un mes de salario por año trabajado.</w:t>
             </w:r>
           </w:p>
         </w:tc>
@@ -623,7 +593,7 @@
                 <w:b/>
                 <w:bCs/>
               </w:rPr>
-              <w:t xml:space="preserve">1942</w:t>
+              <w:t xml:space="preserve">1940–1945</w:t>
             </w:r>
           </w:p>
         </w:tc>
@@ -649,7 +619,7 @@
                 <w:b/>
                 <w:bCs/>
               </w:rPr>
-              <w:t xml:space="preserve">Barcos Liberty</w:t>
+              <w:t xml:space="preserve">Training Within Industry</w:t>
             </w:r>
           </w:p>
         </w:tc>
@@ -671,7 +641,7 @@
           </w:tcPr>
           <w:p>
             <w:r>
-              <w:t xml:space="preserve">Con experiencia, construir un barco pasó de meses a pocas semanas.</w:t>
+              <w:t xml:space="preserve">Programa de EE. UU. que capacita rápido a trabajadores nuevos para producir durante la guerra.</w:t>
             </w:r>
           </w:p>
         </w:tc>
@@ -686,21 +656,21 @@
               <w:bottom w:val="single" w:color="D9D4E7" w:sz="4"/>
               <w:right w:val="single" w:color="D9D4E7" w:sz="4"/>
             </w:tcBorders>
-            <w:shd w:fill="F4F1FD" w:color="auto" w:val="clear"/>
-            <w:tcMar>
-              <w:top w:type="dxa" w:w="80"/>
-              <w:left w:type="dxa" w:w="120"/>
-              <w:bottom w:type="dxa" w:w="80"/>
-              <w:right w:type="dxa" w:w="120"/>
-            </w:tcMar>
-          </w:tcPr>
-          <w:p>
-            <w:r>
-              <w:rPr>
-                <w:b/>
-                <w:bCs/>
-              </w:rPr>
-              <w:t xml:space="preserve">1964</w:t>
+            <w:shd w:fill="E6F6F5" w:color="auto" w:val="clear"/>
+            <w:tcMar>
+              <w:top w:type="dxa" w:w="80"/>
+              <w:left w:type="dxa" w:w="120"/>
+              <w:bottom w:type="dxa" w:w="80"/>
+              <w:right w:type="dxa" w:w="120"/>
+            </w:tcMar>
+          </w:tcPr>
+          <w:p>
+            <w:r>
+              <w:rPr>
+                <w:b/>
+                <w:bCs/>
+              </w:rPr>
+              <w:t xml:space="preserve">1956</w:t>
             </w:r>
           </w:p>
         </w:tc>
@@ -713,21 +683,21 @@
               <w:bottom w:val="single" w:color="D9D4E7" w:sz="4"/>
               <w:right w:val="single" w:color="D9D4E7" w:sz="4"/>
             </w:tcBorders>
-            <w:shd w:fill="F4F1FD" w:color="auto" w:val="clear"/>
-            <w:tcMar>
-              <w:top w:type="dxa" w:w="80"/>
-              <w:left w:type="dxa" w:w="120"/>
-              <w:bottom w:type="dxa" w:w="80"/>
-              <w:right w:type="dxa" w:w="120"/>
-            </w:tcMar>
-          </w:tcPr>
-          <w:p>
-            <w:r>
-              <w:rPr>
-                <w:b/>
-                <w:bCs/>
-              </w:rPr>
-              <w:t xml:space="preserve">Ley de Derechos Civiles (EE. UU.)</w:t>
+            <w:shd w:fill="E6F6F5" w:color="auto" w:val="clear"/>
+            <w:tcMar>
+              <w:top w:type="dxa" w:w="80"/>
+              <w:left w:type="dxa" w:w="120"/>
+              <w:bottom w:type="dxa" w:w="80"/>
+              <w:right w:type="dxa" w:w="120"/>
+            </w:tcMar>
+          </w:tcPr>
+          <w:p>
+            <w:r>
+              <w:rPr>
+                <w:b/>
+                <w:bCs/>
+              </w:rPr>
+              <w:t xml:space="preserve">Harold Asher (RAND)</w:t>
             </w:r>
           </w:p>
         </w:tc>
@@ -740,17 +710,17 @@
               <w:bottom w:val="single" w:color="D9D4E7" w:sz="4"/>
               <w:right w:val="single" w:color="D9D4E7" w:sz="4"/>
             </w:tcBorders>
-            <w:shd w:fill="F4F1FD" w:color="auto" w:val="clear"/>
-            <w:tcMar>
-              <w:top w:type="dxa" w:w="80"/>
-              <w:left w:type="dxa" w:w="120"/>
-              <w:bottom w:type="dxa" w:w="80"/>
-              <w:right w:type="dxa" w:w="120"/>
-            </w:tcMar>
-          </w:tcPr>
-          <w:p>
-            <w:r>
-              <w:t xml:space="preserve">Protege los sistemas de antigüedad legítimos en el trabajo.</w:t>
+            <w:shd w:fill="E6F6F5" w:color="auto" w:val="clear"/>
+            <w:tcMar>
+              <w:top w:type="dxa" w:w="80"/>
+              <w:left w:type="dxa" w:w="120"/>
+              <w:bottom w:type="dxa" w:w="80"/>
+              <w:right w:type="dxa" w:w="120"/>
+            </w:tcMar>
+          </w:tcPr>
+          <w:p>
+            <w:r>
+              <w:t xml:space="preserve">Estudia la fabricación de aviones militares y usa la curva para calcular costos.</w:t>
             </w:r>
           </w:p>
         </w:tc>
@@ -778,7 +748,7 @@
                 <w:b/>
                 <w:bCs/>
               </w:rPr>
-              <w:t xml:space="preserve">1965</w:t>
+              <w:t xml:space="preserve">1977</w:t>
             </w:r>
           </w:p>
         </w:tc>
@@ -804,7 +774,7 @@
                 <w:b/>
                 <w:bCs/>
               </w:rPr>
-              <w:t xml:space="preserve">Ley de Moore</w:t>
+              <w:t xml:space="preserve">Teamsters vs. Estados Unidos</w:t>
             </w:r>
           </w:p>
         </w:tc>
@@ -826,7 +796,7 @@
           </w:tcPr>
           <w:p>
             <w:r>
-              <w:t xml:space="preserve">Los chips se vuelven más potentes y baratos año con año.</w:t>
+              <w:t xml:space="preserve">La Corte Suprema protege los sistemas de antigüedad de los sindicatos.</w:t>
             </w:r>
           </w:p>
         </w:tc>
@@ -841,21 +811,21 @@
               <w:bottom w:val="single" w:color="D9D4E7" w:sz="4"/>
               <w:right w:val="single" w:color="D9D4E7" w:sz="4"/>
             </w:tcBorders>
-            <w:shd w:fill="F4F1FD" w:color="auto" w:val="clear"/>
-            <w:tcMar>
-              <w:top w:type="dxa" w:w="80"/>
-              <w:left w:type="dxa" w:w="120"/>
-              <w:bottom w:type="dxa" w:w="80"/>
-              <w:right w:type="dxa" w:w="120"/>
-            </w:tcMar>
-          </w:tcPr>
-          <w:p>
-            <w:r>
-              <w:rPr>
-                <w:b/>
-                <w:bCs/>
-              </w:rPr>
-              <w:t xml:space="preserve">1986</w:t>
+            <w:shd w:fill="E6F6F5" w:color="auto" w:val="clear"/>
+            <w:tcMar>
+              <w:top w:type="dxa" w:w="80"/>
+              <w:left w:type="dxa" w:w="120"/>
+              <w:bottom w:type="dxa" w:w="80"/>
+              <w:right w:type="dxa" w:w="120"/>
+            </w:tcMar>
+          </w:tcPr>
+          <w:p>
+            <w:r>
+              <w:rPr>
+                <w:b/>
+                <w:bCs/>
+              </w:rPr>
+              <w:t xml:space="preserve">1980</w:t>
             </w:r>
           </w:p>
         </w:tc>
@@ -868,21 +838,21 @@
               <w:bottom w:val="single" w:color="D9D4E7" w:sz="4"/>
               <w:right w:val="single" w:color="D9D4E7" w:sz="4"/>
             </w:tcBorders>
-            <w:shd w:fill="F4F1FD" w:color="auto" w:val="clear"/>
-            <w:tcMar>
-              <w:top w:type="dxa" w:w="80"/>
-              <w:left w:type="dxa" w:w="120"/>
-              <w:bottom w:type="dxa" w:w="80"/>
-              <w:right w:type="dxa" w:w="120"/>
-            </w:tcMar>
-          </w:tcPr>
-          <w:p>
-            <w:r>
-              <w:rPr>
-                <w:b/>
-                <w:bCs/>
-              </w:rPr>
-              <w:t xml:space="preserve">Kaizen</w:t>
+            <w:shd w:fill="E6F6F5" w:color="auto" w:val="clear"/>
+            <w:tcMar>
+              <w:top w:type="dxa" w:w="80"/>
+              <w:left w:type="dxa" w:w="120"/>
+              <w:bottom w:type="dxa" w:w="80"/>
+              <w:right w:type="dxa" w:w="120"/>
+            </w:tcMar>
+          </w:tcPr>
+          <w:p>
+            <w:r>
+              <w:rPr>
+                <w:b/>
+                <w:bCs/>
+              </w:rPr>
+              <w:t xml:space="preserve">Michael Porter</w:t>
             </w:r>
           </w:p>
         </w:tc>
@@ -895,17 +865,17 @@
               <w:bottom w:val="single" w:color="D9D4E7" w:sz="4"/>
               <w:right w:val="single" w:color="D9D4E7" w:sz="4"/>
             </w:tcBorders>
-            <w:shd w:fill="F4F1FD" w:color="auto" w:val="clear"/>
-            <w:tcMar>
-              <w:top w:type="dxa" w:w="80"/>
-              <w:left w:type="dxa" w:w="120"/>
-              <w:bottom w:type="dxa" w:w="80"/>
-              <w:right w:type="dxa" w:w="120"/>
-            </w:tcMar>
-          </w:tcPr>
-          <w:p>
-            <w:r>
-              <w:t xml:space="preserve">Mejora continua japonesa: pequeñas mejoras con la práctica diaria.</w:t>
+            <w:shd w:fill="E6F6F5" w:color="auto" w:val="clear"/>
+            <w:tcMar>
+              <w:top w:type="dxa" w:w="80"/>
+              <w:left w:type="dxa" w:w="120"/>
+              <w:bottom w:type="dxa" w:w="80"/>
+              <w:right w:type="dxa" w:w="120"/>
+            </w:tcMar>
+          </w:tcPr>
+          <w:p>
+            <w:r>
+              <w:t xml:space="preserve">En "Estrategia competitiva" explica que la experiencia acumulada da ventaja en costos.</w:t>
             </w:r>
           </w:p>
         </w:tc>
@@ -933,7 +903,7 @@
                 <w:b/>
                 <w:bCs/>
               </w:rPr>
-              <w:t xml:space="preserve">1997</w:t>
+              <w:t xml:space="preserve">1990</w:t>
             </w:r>
           </w:p>
         </w:tc>
@@ -959,7 +929,7 @@
                 <w:b/>
                 <w:bCs/>
               </w:rPr>
-              <w:t xml:space="preserve">Semanas cotizadas</w:t>
+              <w:t xml:space="preserve">Chile: Ley 19.010</w:t>
             </w:r>
           </w:p>
         </w:tc>
@@ -981,7 +951,7 @@
           </w:tcPr>
           <w:p>
             <w:r>
-              <w:t xml:space="preserve">En México la pensión depende del tiempo cotizado al IMSS; se reformó en 2020.</w:t>
+              <w:t xml:space="preserve">Indemnización de 30 días de sueldo por cada año trabajado, con tope de 11 años.</w:t>
             </w:r>
           </w:p>
         </w:tc>
@@ -996,21 +966,21 @@
               <w:bottom w:val="single" w:color="D9D4E7" w:sz="4"/>
               <w:right w:val="single" w:color="D9D4E7" w:sz="4"/>
             </w:tcBorders>
-            <w:shd w:fill="F4F1FD" w:color="auto" w:val="clear"/>
-            <w:tcMar>
-              <w:top w:type="dxa" w:w="80"/>
-              <w:left w:type="dxa" w:w="120"/>
-              <w:bottom w:type="dxa" w:w="80"/>
-              <w:right w:type="dxa" w:w="120"/>
-            </w:tcMar>
-          </w:tcPr>
-          <w:p>
-            <w:r>
-              <w:rPr>
-                <w:b/>
-                <w:bCs/>
-              </w:rPr>
-              <w:t xml:space="preserve">2000</w:t>
+            <w:shd w:fill="E6F6F5" w:color="auto" w:val="clear"/>
+            <w:tcMar>
+              <w:top w:type="dxa" w:w="80"/>
+              <w:left w:type="dxa" w:w="120"/>
+              <w:bottom w:type="dxa" w:w="80"/>
+              <w:right w:type="dxa" w:w="120"/>
+            </w:tcMar>
+          </w:tcPr>
+          <w:p>
+            <w:r>
+              <w:rPr>
+                <w:b/>
+                <w:bCs/>
+              </w:rPr>
+              <w:t xml:space="preserve">1993</w:t>
             </w:r>
           </w:p>
         </w:tc>
@@ -1023,21 +993,21 @@
               <w:bottom w:val="single" w:color="D9D4E7" w:sz="4"/>
               <w:right w:val="single" w:color="D9D4E7" w:sz="4"/>
             </w:tcBorders>
-            <w:shd w:fill="F4F1FD" w:color="auto" w:val="clear"/>
-            <w:tcMar>
-              <w:top w:type="dxa" w:w="80"/>
-              <w:left w:type="dxa" w:w="120"/>
-              <w:bottom w:type="dxa" w:w="80"/>
-              <w:right w:type="dxa" w:w="120"/>
-            </w:tcMar>
-          </w:tcPr>
-          <w:p>
-            <w:r>
-              <w:rPr>
-                <w:b/>
-                <w:bCs/>
-              </w:rPr>
-              <w:t xml:space="preserve">Ley de Haitz</w:t>
+            <w:shd w:fill="E6F6F5" w:color="auto" w:val="clear"/>
+            <w:tcMar>
+              <w:top w:type="dxa" w:w="80"/>
+              <w:left w:type="dxa" w:w="120"/>
+              <w:bottom w:type="dxa" w:w="80"/>
+              <w:right w:type="dxa" w:w="120"/>
+            </w:tcMar>
+          </w:tcPr>
+          <w:p>
+            <w:r>
+              <w:rPr>
+                <w:b/>
+                <w:bCs/>
+              </w:rPr>
+              <w:t xml:space="preserve">Anders Ericsson</w:t>
             </w:r>
           </w:p>
         </w:tc>
@@ -1050,17 +1020,17 @@
               <w:bottom w:val="single" w:color="D9D4E7" w:sz="4"/>
               <w:right w:val="single" w:color="D9D4E7" w:sz="4"/>
             </w:tcBorders>
-            <w:shd w:fill="F4F1FD" w:color="auto" w:val="clear"/>
-            <w:tcMar>
-              <w:top w:type="dxa" w:w="80"/>
-              <w:left w:type="dxa" w:w="120"/>
-              <w:bottom w:type="dxa" w:w="80"/>
-              <w:right w:type="dxa" w:w="120"/>
-            </w:tcMar>
-          </w:tcPr>
-          <w:p>
-            <w:r>
-              <w:t xml:space="preserve">Los focos LED se vuelven mucho más baratos y eficientes.</w:t>
+            <w:shd w:fill="E6F6F5" w:color="auto" w:val="clear"/>
+            <w:tcMar>
+              <w:top w:type="dxa" w:w="80"/>
+              <w:left w:type="dxa" w:w="120"/>
+              <w:bottom w:type="dxa" w:w="80"/>
+              <w:right w:type="dxa" w:w="120"/>
+            </w:tcMar>
+          </w:tcPr>
+          <w:p>
+            <w:r>
+              <w:t xml:space="preserve">Práctica deliberada: no basta el tiempo, importa cómo se practica (base de la "regla de las 10 000 horas").</w:t>
             </w:r>
           </w:p>
         </w:tc>
@@ -1088,7 +1058,7 @@
                 <w:b/>
                 <w:bCs/>
               </w:rPr>
-              <w:t xml:space="preserve">2021–hoy</w:t>
+              <w:t xml:space="preserve">2024</w:t>
             </w:r>
           </w:p>
         </w:tc>
@@ -1114,7 +1084,7 @@
                 <w:b/>
                 <w:bCs/>
               </w:rPr>
-              <w:t xml:space="preserve">Teletrabajo</w:t>
+              <w:t xml:space="preserve">Menos años por empleo</w:t>
             </w:r>
           </w:p>
         </w:tc>
@@ -1136,7 +1106,7 @@
           </w:tcPr>
           <w:p>
             <w:r>
-              <w:t xml:space="preserve">La gente cambia más de empleo y se valoran más las habilidades.</w:t>
+              <w:t xml:space="preserve">En EE. UU. la antigüedad típica en un empleo baja a 3,9 años (antes 4,1 en 2022): la gente cambia más de trabajo.</w:t>
             </w:r>
           </w:p>
         </w:tc>
@@ -1150,12 +1120,12 @@
         <w:rPr>
           <w:b/>
           <w:bCs/>
-          <w:color w:val="E07B16"/>
+          <w:color w:val="DB2777"/>
         </w:rPr>
         <w:t xml:space="preserve">Si solo memorizas tres: </w:t>
       </w:r>
       <w:r>
-        <w:t xml:space="preserve">1908 (Ford Modelo T: más producción, menor precio), 1936 (Wright crea la curva de aprendizaje) y 1942 (barcos Liberty).</w:t>
+        <w:t xml:space="preserve">1919 (Thurstone escribe la ecuación de la curva), 1934 (Colombia crea las cesantías) y 1993 (Ericsson y la práctica deliberada).</w:t>
       </w:r>
     </w:p>
     <w:p>
@@ -1165,7 +1135,7 @@
       </w:pPr>
       <w:r>
         <w:rPr>
-          <w:color w:val="5B3FD6"/>
+          <w:color w:val="0E8F8A"/>
         </w:rPr>
         <w:t xml:space="preserve">3. Importancia en la vida cotidiana</w:t>
       </w:r>
@@ -1187,7 +1157,7 @@
         <w:t xml:space="preserve">Definirlos </w:t>
       </w:r>
       <w:r>
-        <w:t xml:space="preserve">sirve para no confundir tiempo con experiencia y tomar decisiones justas.</w:t>
+        <w:t xml:space="preserve">ayuda a entender que pasar años en algo no es lo mismo que mejorar en ello.</w:t>
       </w:r>
     </w:p>
     <w:p>
@@ -1207,18 +1177,19 @@
         <w:t xml:space="preserve">Saber cómo operan </w:t>
       </w:r>
       <w:r>
-        <w:t xml:space="preserve">sirve para medirlos: las horas que ahorras con la práctica, los años de servicio, los días de vacaciones.</w:t>
-      </w:r>
-    </w:p>
-    <w:p>
-      <w:pPr>
+        <w:t xml:space="preserve">permite calcular cosas reales: cuánto mejoras con cada práctica o cuánto dinero te corresponde por tus años de servicio.</w:t>
+      </w:r>
+    </w:p>
+    <w:p>
+      <w:pPr>
+        <w:keepNext/>
         <w:spacing w:after="80" w:before="200"/>
       </w:pPr>
       <w:r>
         <w:rPr>
           <w:b/>
           <w:bCs/>
-          <w:color w:val="5B3FD6"/>
+          <w:color w:val="0E8F8A"/>
         </w:rPr>
         <w:t xml:space="preserve">Ejemplos de curva de la experiencia</w:t>
       </w:r>
@@ -1246,7 +1217,7 @@
         <w:spacing w:after="80"/>
       </w:pPr>
       <w:r>
-        <w:t xml:space="preserve">Tocar guitarra o jugar un videojuego: mejoras con la práctica.</w:t>
+        <w:t xml:space="preserve">Tocar guitarra: al principio cuesta mucho y luego avanzas más rápido.</w:t>
       </w:r>
     </w:p>
     <w:p>
@@ -1272,18 +1243,19 @@
         <w:spacing w:after="80"/>
       </w:pPr>
       <w:r>
-        <w:t xml:space="preserve">Focos LED y computadoras cada vez más baratos.</w:t>
-      </w:r>
-    </w:p>
-    <w:p>
-      <w:pPr>
+        <w:t xml:space="preserve">Practicar con metas y corrigiendo errores (práctica deliberada) rinde más que solo repetir.</w:t>
+      </w:r>
+    </w:p>
+    <w:p>
+      <w:pPr>
+        <w:keepNext/>
         <w:spacing w:after="80" w:before="200"/>
       </w:pPr>
       <w:r>
         <w:rPr>
           <w:b/>
           <w:bCs/>
-          <w:color w:val="E07B16"/>
+          <w:color w:val="DB2777"/>
         </w:rPr>
         <w:t xml:space="preserve">Ejemplos de antigüedad</w:t>
       </w:r>
@@ -1298,7 +1270,7 @@
         <w:spacing w:after="80"/>
       </w:pPr>
       <w:r>
-        <w:t xml:space="preserve">Las semanas cotizadas al IMSS cuentan para la pensión.</w:t>
+        <w:t xml:space="preserve">Al terminar un trabajo te pagan según tus años de servicio (cesantías o indemnización).</w:t>
       </w:r>
     </w:p>
     <w:p>
@@ -1311,7 +1283,7 @@
         <w:spacing w:after="80"/>
       </w:pPr>
       <w:r>
-        <w:t xml:space="preserve">En el trabajo: vacaciones y prima según los años de servicio.</w:t>
+        <w:t xml:space="preserve">En un equipo o club, los de más tiempo suelen ser capitanes.</w:t>
       </w:r>
     </w:p>
     <w:p>
@@ -1324,7 +1296,7 @@
         <w:spacing w:after="80"/>
       </w:pPr>
       <w:r>
-        <w:t xml:space="preserve">En un equipo o club: los de más tiempo suelen ser capitanes.</w:t>
+        <w:t xml:space="preserve">En el gobierno, el servicio civil de carrera reconoce mérito y años.</w:t>
       </w:r>
     </w:p>
     <w:p>
@@ -1337,7 +1309,7 @@
         <w:spacing w:after="80"/>
       </w:pPr>
       <w:r>
-        <w:t xml:space="preserve">En la escuela: los de grados mayores tienen más responsabilidades.</w:t>
+        <w:t xml:space="preserve">Hoy la gente cambia más de empleo, así que acumula menos antigüedad en un solo lugar.</w:t>
       </w:r>
     </w:p>
     <w:p>
@@ -1347,7 +1319,7 @@
       </w:pPr>
       <w:r>
         <w:rPr>
-          <w:color w:val="5B3FD6"/>
+          <w:color w:val="0E8F8A"/>
         </w:rPr>
         <w:t xml:space="preserve">4. Preguntas de repaso</w:t>
       </w:r>
@@ -1379,7 +1351,7 @@
           <w:b/>
           <w:bCs/>
         </w:rPr>
-        <w:t xml:space="preserve">¿Qué dijo Adam Smith en 1776 sobre el trabajo?</w:t>
+        <w:t xml:space="preserve">¿Qué creó la Ley Pendleton de 1883?</w:t>
       </w:r>
     </w:p>
     <w:p>
@@ -1391,12 +1363,12 @@
         <w:rPr>
           <w:b/>
           <w:bCs/>
-          <w:color w:val="5B3FD6"/>
+          <w:color w:val="0E8F8A"/>
         </w:rPr>
         <w:t xml:space="preserve">Respuesta: </w:t>
       </w:r>
       <w:r>
-        <w:t xml:space="preserve">Que repetir una sola tarea (división del trabajo) hace más hábil al trabajador.</w:t>
+        <w:t xml:space="preserve">El servicio civil de carrera en EE. UU.: puestos públicos por mérito.</w:t>
       </w:r>
     </w:p>
     <w:p>
@@ -1413,7 +1385,7 @@
           <w:b/>
           <w:bCs/>
         </w:rPr>
-        <w:t xml:space="preserve">¿Qué pasó con el precio del Ford Modelo T?</w:t>
+        <w:t xml:space="preserve">¿Qué propuso Frederick Taylor en 1911?</w:t>
       </w:r>
     </w:p>
     <w:p>
@@ -1425,12 +1397,12 @@
         <w:rPr>
           <w:b/>
           <w:bCs/>
-          <w:color w:val="5B3FD6"/>
+          <w:color w:val="0E8F8A"/>
         </w:rPr>
         <w:t xml:space="preserve">Respuesta: </w:t>
       </w:r>
       <w:r>
-        <w:t xml:space="preserve">Bajó de 850 a 260 dólares mientras se fabricaban más autos.</w:t>
+        <w:t xml:space="preserve">La administración científica: medir tiempos y movimientos para trabajar más rápido.</w:t>
       </w:r>
     </w:p>
     <w:p>
@@ -1447,7 +1419,7 @@
           <w:b/>
           <w:bCs/>
         </w:rPr>
-        <w:t xml:space="preserve">¿Quién creó la curva de aprendizaje y en qué año?</w:t>
+        <w:t xml:space="preserve">¿Quién escribió la primera ecuación de la curva de aprendizaje?</w:t>
       </w:r>
     </w:p>
     <w:p>
@@ -1459,12 +1431,12 @@
         <w:rPr>
           <w:b/>
           <w:bCs/>
-          <w:color w:val="5B3FD6"/>
+          <w:color w:val="0E8F8A"/>
         </w:rPr>
         <w:t xml:space="preserve">Respuesta: </w:t>
       </w:r>
       <w:r>
-        <w:t xml:space="preserve">T. P. Wright, en 1936.</w:t>
+        <w:t xml:space="preserve">Louis L. Thurstone, en 1919.</w:t>
       </w:r>
     </w:p>
     <w:p>
@@ -1481,7 +1453,7 @@
           <w:b/>
           <w:bCs/>
         </w:rPr>
-        <w:t xml:space="preserve">¿Qué ejemplo de la Segunda Guerra muestra la curva?</w:t>
+        <w:t xml:space="preserve">¿Qué son las cesantías en Colombia?</w:t>
       </w:r>
     </w:p>
     <w:p>
@@ -1493,12 +1465,12 @@
         <w:rPr>
           <w:b/>
           <w:bCs/>
-          <w:color w:val="5B3FD6"/>
+          <w:color w:val="0E8F8A"/>
         </w:rPr>
         <w:t xml:space="preserve">Respuesta: </w:t>
       </w:r>
       <w:r>
-        <w:t xml:space="preserve">Los barcos Liberty: se construían cada vez más rápido.</w:t>
+        <w:t xml:space="preserve">Un pago al terminar el trabajo: un mes de salario por cada año (Ley 10 de 1934 y Código de 1950).</w:t>
       </w:r>
     </w:p>
     <w:p>
@@ -1515,7 +1487,7 @@
           <w:b/>
           <w:bCs/>
         </w:rPr>
-        <w:t xml:space="preserve">¿Qué protege la Ley de Derechos Civiles de 1964 sobre la antigüedad?</w:t>
+        <w:t xml:space="preserve">¿Qué fue Training Within Industry?</w:t>
       </w:r>
     </w:p>
     <w:p>
@@ -1527,12 +1499,12 @@
         <w:rPr>
           <w:b/>
           <w:bCs/>
-          <w:color w:val="5B3FD6"/>
+          <w:color w:val="0E8F8A"/>
         </w:rPr>
         <w:t xml:space="preserve">Respuesta: </w:t>
       </w:r>
       <w:r>
-        <w:t xml:space="preserve">Los sistemas de antigüedad legítimos en el trabajo.</w:t>
+        <w:t xml:space="preserve">Un programa de EE. UU. (1940–1945) para capacitar rápido a trabajadores en la guerra.</w:t>
       </w:r>
     </w:p>
     <w:p>
@@ -1549,7 +1521,7 @@
           <w:b/>
           <w:bCs/>
         </w:rPr>
-        <w:t xml:space="preserve">¿Qué es el Kaizen?</w:t>
+        <w:t xml:space="preserve">¿Qué dice la ley chilena 19.010 de 1990?</w:t>
       </w:r>
     </w:p>
     <w:p>
@@ -1561,12 +1533,12 @@
         <w:rPr>
           <w:b/>
           <w:bCs/>
-          <w:color w:val="5B3FD6"/>
+          <w:color w:val="0E8F8A"/>
         </w:rPr>
         <w:t xml:space="preserve">Respuesta: </w:t>
       </w:r>
       <w:r>
-        <w:t xml:space="preserve">La mejora continua japonesa: pequeñas mejoras con la práctica diaria.</w:t>
+        <w:t xml:space="preserve">30 días de sueldo por año trabajado, con tope de 11 años.</w:t>
       </w:r>
     </w:p>
     <w:p>
@@ -1583,7 +1555,7 @@
           <w:b/>
           <w:bCs/>
         </w:rPr>
-        <w:t xml:space="preserve">¿Qué son las semanas cotizadas?</w:t>
+        <w:t xml:space="preserve">¿Qué es la práctica deliberada?</w:t>
       </w:r>
     </w:p>
     <w:p>
@@ -1595,12 +1567,12 @@
         <w:rPr>
           <w:b/>
           <w:bCs/>
-          <w:color w:val="5B3FD6"/>
+          <w:color w:val="0E8F8A"/>
         </w:rPr>
         <w:t xml:space="preserve">Respuesta: </w:t>
       </w:r>
       <w:r>
-        <w:t xml:space="preserve">El tiempo que has cotizado al IMSS; cuenta para tu pensión.</w:t>
+        <w:t xml:space="preserve">La idea de Anders Ericsson (1993): mejorar con metas y corrección, no solo con tiempo.</w:t>
       </w:r>
     </w:p>
     <w:p>
@@ -1617,7 +1589,7 @@
           <w:b/>
           <w:bCs/>
         </w:rPr>
-        <w:t xml:space="preserve">¿Cuál es la diferencia entre antigüedad y experiencia?</w:t>
+        <w:t xml:space="preserve">¿Qué pasa hoy con la antigüedad?</w:t>
       </w:r>
     </w:p>
     <w:p>
@@ -1629,12 +1601,12 @@
         <w:rPr>
           <w:b/>
           <w:bCs/>
-          <w:color w:val="5B3FD6"/>
+          <w:color w:val="0E8F8A"/>
         </w:rPr>
         <w:t xml:space="preserve">Respuesta: </w:t>
       </w:r>
       <w:r>
-        <w:t xml:space="preserve">La antigüedad es tiempo; la experiencia es práctica.</w:t>
+        <w:t xml:space="preserve">Baja: en EE. UU. la antigüedad típica es de 3,9 años (2024).</w:t>
       </w:r>
     </w:p>
     <w:p>
@@ -1644,7 +1616,7 @@
       </w:pPr>
       <w:r>
         <w:rPr>
-          <w:color w:val="E07B16"/>
+          <w:color w:val="DB2777"/>
         </w:rPr>
         <w:t xml:space="preserve">5. Frase para cerrar</w:t>
       </w:r>
@@ -1658,7 +1630,7 @@
           <w:i/>
           <w:iCs/>
         </w:rPr>
-        <w:t xml:space="preserve">"Equivocarse al principio es normal: cada repetición nos hace más eficientes. El tiempo da derechos, pero la práctica es lo que da experiencia."</w:t>
+        <w:t xml:space="preserve">"No importa solo cuántos años llevo haciendo algo, sino cómo los aprovecho: la práctica bien hecha es la que me hace mejor."</w:t>
       </w:r>
     </w:p>
     <w:sectPr>

</xml_diff>